<commit_message>
Document GSN SDG alignment in whitepaper
</commit_message>
<xml_diff>
--- a/docs/whitepaper_variants/GSN_Customer_Discovery_Plain_Language_Copy.docx
+++ b/docs/whitepaper_variants/GSN_Customer_Discovery_Plain_Language_Copy.docx
@@ -1,6 +1,6 @@
 
 <file path=word/document.xml><?xml version="1.0" encoding="utf-8"?>
-<w:document xmlns:w="http://schemas.openxmlformats.org/wordprocessingml/2006/main" xmlns:r="http://schemas.openxmlformats.org/officeDocument/2006/relationships">
+<w:document xmlns:w="http://schemas.openxmlformats.org/wordprocessingml/2006/main">
   <w:body>
     <w:p>
       <w:pPr>
@@ -430,6 +430,29 @@
     <w:p>
       <w:r>
         <w:t xml:space="preserve">The most useful feedback is not praise. The most useful feedback is honesty. Tell us where the idea is confusing, risky, unnecessary, too ambitious, or genuinely useful. If the idea does not fit your community, say so. If it fits only one narrow decision, tell us which one.</w:t>
+      </w:r>
+    </w:p>
+    <w:p>
+      <w:pPr>
+        <w:pStyle w:val="Heading1"/>
+      </w:pPr>
+      <w:r>
+        <w:t>How this connects to UN development goals</w:t>
+      </w:r>
+    </w:p>
+    <w:p>
+      <w:r>
+        <w:t>GSN should not claim to fulfil United Nations Sustainable Development Goals by itself. The honest claim is that it can align with them and contribute evidence toward them when real communities use it responsibly.</w:t>
+      </w:r>
+    </w:p>
+    <w:p>
+      <w:r>
+        <w:t>The strongest links are poverty reduction, decent work, innovation infrastructure, reduced inequality, sustainable communities, strong institutions, and partnerships. In simple terms: GSN helps communities keep fair records of contribution, trade, responsibility, support, and trust so people and small organisations are not judged only by what formal systems already know about them.</w:t>
+      </w:r>
+    </w:p>
+    <w:p>
+      <w:r>
+        <w:t>For customer discovery, the important question is practical: can this help one real community make one fairer, safer, or more useful decision without exposing private information or turning people into scores?</w:t>
       </w:r>
     </w:p>
     <w:p>

</xml_diff>